<commit_message>
Pre-submission bug-check pass: replace 3 em-dashes in supplement section headings S4, S5, S6 with ' - ' per zero-em-dash style rule (manuscript was already clean); add scripts/bug_check.py as canonical pre-submission verifier (figure file existence, citation resolution against paper.bib, section / figure / supplementary-figure reference consistency, table inventory, TODO markers, em / en dash counts, vendor mentions, banned phrases, AI-tells); final state - manuscript 7,715 words, 7 main figures embedded, 4 supplementary figures embedded, 13 numbered tables, 25 cited references all resolved, zero hard issues
</commit_message>
<xml_diff>
--- a/paper/supplement.docx
+++ b/paper/supplement.docx
@@ -1185,13 +1185,13 @@
       </w:r>
     </w:p>
     <w:bookmarkEnd w:id="11"/>
-    <w:bookmarkStart w:id="12" w:name="X0b656fa67bfd4f29de9bde36f537b5100d28123"/>
+    <w:bookmarkStart w:id="12" w:name="X4403ed5302f8aa5ac53e47b39aacf71d2583666"/>
     <w:p>
       <w:pPr>
         <w:pStyle w:val="Heading2"/>
       </w:pPr>
       <w:r>
-        <w:t xml:space="preserve">S4. Per-subject effect sizes — stress vs baseline</w:t>
+        <w:t xml:space="preserve">S4. Per-subject effect sizes - stress vs baseline</w:t>
       </w:r>
     </w:p>
     <w:p>
@@ -2175,13 +2175,13 @@
       </w:r>
     </w:p>
     <w:bookmarkEnd w:id="12"/>
-    <w:bookmarkStart w:id="13" w:name="X81d79503a7cd54d777e0c1a77268294ecb67848"/>
+    <w:bookmarkStart w:id="13" w:name="X31ea05ff7c2176dab696ba8e37a23f6e9bf749d"/>
     <w:p>
       <w:pPr>
         <w:pStyle w:val="Heading2"/>
       </w:pPr>
       <w:r>
-        <w:t xml:space="preserve">S5. Per-subject effect sizes — amusement vs baseline</w:t>
+        <w:t xml:space="preserve">S5. Per-subject effect sizes - amusement vs baseline</w:t>
       </w:r>
     </w:p>
     <w:p>
@@ -3040,13 +3040,13 @@
       </w:r>
     </w:p>
     <w:bookmarkEnd w:id="13"/>
-    <w:bookmarkStart w:id="14" w:name="X07f0dfa1c5b124f5423e6c142609b1b866a74a1"/>
+    <w:bookmarkStart w:id="14" w:name="X29f0a47f112df3f78b6d7c52960b87d47892d67"/>
     <w:p>
       <w:pPr>
         <w:pStyle w:val="Heading2"/>
       </w:pPr>
       <w:r>
-        <w:t xml:space="preserve">S6. Learned trust-score weights — training and holdout</w:t>
+        <w:t xml:space="preserve">S6. Learned trust-score weights - training and holdout</w:t>
       </w:r>
     </w:p>
     <w:p>

</xml_diff>

<commit_message>
Pre-submission: clean up supplement structure. Remove the orphaned References heading between S6 and S7, add S7's missing section period, and append a proper References section with a citeproc anchor after S10 so the supplement's two citations render under a heading
</commit_message>
<xml_diff>
--- a/paper/supplement.docx
+++ b/paper/supplement.docx
@@ -3102,23 +3102,13 @@
       </w:r>
     </w:p>
     <w:bookmarkEnd w:id="14"/>
-    <w:bookmarkStart w:id="15" w:name="references"/>
+    <w:bookmarkStart w:id="18" w:name="X012103020424685eb42f54b73b5cd759fabd273"/>
     <w:p>
       <w:pPr>
         <w:pStyle w:val="Heading2"/>
       </w:pPr>
       <w:r>
-        <w:t xml:space="preserve">References</w:t>
-      </w:r>
-    </w:p>
-    <w:bookmarkEnd w:id="15"/>
-    <w:bookmarkStart w:id="19" w:name="X862d6072542f48d698c2bf79db7c83b6aa8b908"/>
-    <w:p>
-      <w:pPr>
-        <w:pStyle w:val="Heading2"/>
-      </w:pPr>
-      <w:r>
-        <w:t xml:space="preserve">S7 Threshold sensitivity for the in-house SQI baseline</w:t>
+        <w:t xml:space="preserve">S7. Threshold sensitivity for the in-house SQI baseline</w:t>
       </w:r>
     </w:p>
     <w:p>
@@ -4906,18 +4896,18 @@
           <wp:inline>
             <wp:extent cx="5334000" cy="2658904"/>
             <wp:effectExtent b="0" l="0" r="0" t="0"/>
-            <wp:docPr descr="Supplementary Figure S2. Threshold-sensitivity analysis for the in-house PPG SQI baseline on WESAD (a) and PPG-DaLiA (b). Solid line: joint condition (in-house passes AND all three published methods fail). Dashed line: published-only consensus rejection (independent of in-house decision). Both lines are nearly flat across the in-house threshold range 0.50 to 0.95 (range across thresholds &lt; 0.05 percentage points on both datasets), confirming the headline disagreement finding is robust to the in-house threshold choice. The default threshold (0.70) is marked." title="" id="17" name="Picture"/>
+            <wp:docPr descr="Supplementary Figure S2. Threshold-sensitivity analysis for the in-house PPG SQI baseline on WESAD (a) and PPG-DaLiA (b). Solid line: joint condition (in-house passes AND all three published methods fail). Dashed line: published-only consensus rejection (independent of in-house decision). Both lines are nearly flat across the in-house threshold range 0.50 to 0.95 (range across thresholds &lt; 0.05 percentage points on both datasets), confirming the headline disagreement finding is robust to the in-house threshold choice. The default threshold (0.70) is marked." title="" id="16" name="Picture"/>
             <a:graphic>
               <a:graphicData uri="http://schemas.openxmlformats.org/drawingml/2006/picture">
                 <pic:pic>
                   <pic:nvPicPr>
-                    <pic:cNvPr descr="paper/figures/figS2_threshold_sensitivity.png" id="18" name="Picture"/>
+                    <pic:cNvPr descr="paper/figures/figS2_threshold_sensitivity.png" id="17" name="Picture"/>
                     <pic:cNvPicPr>
                       <a:picLocks noChangeArrowheads="1" noChangeAspect="1"/>
                     </pic:cNvPicPr>
                   </pic:nvPicPr>
                   <pic:blipFill>
-                    <a:blip r:embed="rId16"/>
+                    <a:blip r:embed="rId15"/>
                     <a:stretch>
                       <a:fillRect/>
                     </a:stretch>
@@ -4952,8 +4942,8 @@
         <w:t xml:space="preserve">Supplementary Figure S2. Threshold-sensitivity analysis for the in-house PPG SQI baseline on WESAD (a) and PPG-DaLiA (b). Solid line: joint condition (in-house passes AND all three published methods fail). Dashed line: published-only consensus rejection (independent of in-house decision). Both lines are nearly flat across the in-house threshold range 0.50 to 0.95 (range across thresholds &lt; 0.05 percentage points on both datasets), confirming the headline disagreement finding is robust to the in-house threshold choice. The default threshold (0.70) is marked.</w:t>
       </w:r>
     </w:p>
-    <w:bookmarkEnd w:id="19"/>
-    <w:bookmarkStart w:id="23" w:name="s8.-loso-subject-level-recalibration"/>
+    <w:bookmarkEnd w:id="18"/>
+    <w:bookmarkStart w:id="22" w:name="s8.-loso-subject-level-recalibration"/>
     <w:p>
       <w:pPr>
         <w:pStyle w:val="Heading2"/>
@@ -5007,18 +4997,18 @@
           <wp:inline>
             <wp:extent cx="5334000" cy="2734361"/>
             <wp:effectExtent b="0" l="0" r="0" t="0"/>
-            <wp:docPr descr="Supplementary Figure S3. LOSO per-subject held-out Cohen’s kappa from the subject-level recalibration cross-validation on WESAD (n = 15 folds). Bars sorted by held-out kappa ascending. Red bars: non-degenerate folds (in-house SQI varies on the held-out subject so kappa is meaningful). Grey bars: degenerate folds (in-house SQI passes 100% of held-out windows so kappa is forced to zero). Mean held-out kappa = -0.063 (dashed line)." title="" id="21" name="Picture"/>
+            <wp:docPr descr="Supplementary Figure S3. LOSO per-subject held-out Cohen’s kappa from the subject-level recalibration cross-validation on WESAD (n = 15 folds). Bars sorted by held-out kappa ascending. Red bars: non-degenerate folds (in-house SQI varies on the held-out subject so kappa is meaningful). Grey bars: degenerate folds (in-house SQI passes 100% of held-out windows so kappa is forced to zero). Mean held-out kappa = -0.063 (dashed line)." title="" id="20" name="Picture"/>
             <a:graphic>
               <a:graphicData uri="http://schemas.openxmlformats.org/drawingml/2006/picture">
                 <pic:pic>
                   <pic:nvPicPr>
-                    <pic:cNvPr descr="paper/figures/figS3_loso_recalibration.png" id="22" name="Picture"/>
+                    <pic:cNvPr descr="paper/figures/figS3_loso_recalibration.png" id="21" name="Picture"/>
                     <pic:cNvPicPr>
                       <a:picLocks noChangeArrowheads="1" noChangeAspect="1"/>
                     </pic:cNvPicPr>
                   </pic:nvPicPr>
                   <pic:blipFill>
-                    <a:blip r:embed="rId20"/>
+                    <a:blip r:embed="rId19"/>
                     <a:stretch>
                       <a:fillRect/>
                     </a:stretch>
@@ -5053,8 +5043,8 @@
         <w:t xml:space="preserve">Supplementary Figure S3. LOSO per-subject held-out Cohen’s kappa from the subject-level recalibration cross-validation on WESAD (n = 15 folds). Bars sorted by held-out kappa ascending. Red bars: non-degenerate folds (in-house SQI varies on the held-out subject so kappa is meaningful). Grey bars: degenerate folds (in-house SQI passes 100% of held-out windows so kappa is forced to zero). Mean held-out kappa = -0.063 (dashed line).</w:t>
       </w:r>
     </w:p>
-    <w:bookmarkEnd w:id="23"/>
-    <w:bookmarkStart w:id="27" w:name="X85a902ec8e3f7eb9ff8083c7a077c6555cf8b03"/>
+    <w:bookmarkEnd w:id="22"/>
+    <w:bookmarkStart w:id="26" w:name="X85a902ec8e3f7eb9ff8083c7a077c6555cf8b03"/>
     <w:p>
       <w:pPr>
         <w:pStyle w:val="Heading2"/>
@@ -5080,18 +5070,18 @@
           <wp:inline>
             <wp:extent cx="5334000" cy="2309090"/>
             <wp:effectExtent b="0" l="0" r="0" t="0"/>
-            <wp:docPr descr="Supplementary Figure S4. Verdict gap between the in-house threshold-based PPG SQI and the three-baseline consensus on WESAD (n = 15 subjects, 6,585 5-second windows). The in-house pipeline passes every window. Applying Orphanidou 2015, Sukor 2011, and Elgendi 2016 simultaneously, 2,935 of the same 6,585 windows (44.6%) are rejected by all three published methods." title="" id="25" name="Picture"/>
+            <wp:docPr descr="Supplementary Figure S4. Verdict gap between the in-house threshold-based PPG SQI and the three-baseline consensus on WESAD (n = 15 subjects, 6,585 5-second windows). The in-house pipeline passes every window. Applying Orphanidou 2015, Sukor 2011, and Elgendi 2016 simultaneously, 2,935 of the same 6,585 windows (44.6%) are rejected by all three published methods." title="" id="24" name="Picture"/>
             <a:graphic>
               <a:graphicData uri="http://schemas.openxmlformats.org/drawingml/2006/picture">
                 <pic:pic>
                   <pic:nvPicPr>
-                    <pic:cNvPr descr="paper/figures/fig4_rejection_cascade.png" id="26" name="Picture"/>
+                    <pic:cNvPr descr="paper/figures/fig4_rejection_cascade.png" id="25" name="Picture"/>
                     <pic:cNvPicPr>
                       <a:picLocks noChangeArrowheads="1" noChangeAspect="1"/>
                     </pic:cNvPicPr>
                   </pic:nvPicPr>
                   <pic:blipFill>
-                    <a:blip r:embed="rId24"/>
+                    <a:blip r:embed="rId23"/>
                     <a:stretch>
                       <a:fillRect/>
                     </a:stretch>
@@ -5126,8 +5116,8 @@
         <w:t xml:space="preserve">Supplementary Figure S4. Verdict gap between the in-house threshold-based PPG SQI and the three-baseline consensus on WESAD (n = 15 subjects, 6,585 5-second windows). The in-house pipeline passes every window. Applying Orphanidou 2015, Sukor 2011, and Elgendi 2016 simultaneously, 2,935 of the same 6,585 windows (44.6%) are rejected by all three published methods.</w:t>
       </w:r>
     </w:p>
-    <w:bookmarkEnd w:id="27"/>
-    <w:bookmarkStart w:id="46" w:name="X04ab08bc3407dee7c546d17ca973c428093030b"/>
+    <w:bookmarkEnd w:id="26"/>
+    <w:bookmarkStart w:id="40" w:name="X04ab08bc3407dee7c546d17ca973c428093030b"/>
     <w:p>
       <w:pPr>
         <w:pStyle w:val="Heading2"/>
@@ -5136,7 +5126,7 @@
         <w:t xml:space="preserve">S10. Methodological validation on synthetic data</w:t>
       </w:r>
     </w:p>
-    <w:bookmarkStart w:id="31" w:name="Xbe7820ab46dbaab10ce976249df5d5760fa80b5"/>
+    <w:bookmarkStart w:id="30" w:name="Xbe7820ab46dbaab10ce976249df5d5760fa80b5"/>
     <w:p>
       <w:pPr>
         <w:pStyle w:val="Heading3"/>
@@ -5178,18 +5168,18 @@
           <wp:inline>
             <wp:extent cx="5334000" cy="3977375"/>
             <wp:effectExtent b="0" l="0" r="0" t="0"/>
-            <wp:docPr descr="Supplementary Figure S5. Cohort-level Digital Biomarker Trust Score on the synthetic cohort (n = 300 participants, 60 days each). Mean overall DBTS = 74.11 (moderate category); 31 participants in the high category, 266 moderate, 3 low." title="" id="29" name="Picture"/>
+            <wp:docPr descr="Supplementary Figure S5. Cohort-level Digital Biomarker Trust Score on the synthetic cohort (n = 300 participants, 60 days each). Mean overall DBTS = 74.11 (moderate category); 31 participants in the high category, 266 moderate, 3 low." title="" id="28" name="Picture"/>
             <a:graphic>
               <a:graphicData uri="http://schemas.openxmlformats.org/drawingml/2006/picture">
                 <pic:pic>
                   <pic:nvPicPr>
-                    <pic:cNvPr descr="paper/figures/fig2_synthetic_headline.png" id="30" name="Picture"/>
+                    <pic:cNvPr descr="paper/figures/fig2_synthetic_headline.png" id="29" name="Picture"/>
                     <pic:cNvPicPr>
                       <a:picLocks noChangeArrowheads="1" noChangeAspect="1"/>
                     </pic:cNvPicPr>
                   </pic:nvPicPr>
                   <pic:blipFill>
-                    <a:blip r:embed="rId28"/>
+                    <a:blip r:embed="rId27"/>
                     <a:stretch>
                       <a:fillRect/>
                     </a:stretch>
@@ -5224,8 +5214,8 @@
         <w:t xml:space="preserve">Supplementary Figure S5. Cohort-level Digital Biomarker Trust Score on the synthetic cohort (n = 300 participants, 60 days each). Mean overall DBTS = 74.11 (moderate category); 31 participants in the high category, 266 moderate, 3 low.</w:t>
       </w:r>
     </w:p>
-    <w:bookmarkEnd w:id="31"/>
-    <w:bookmarkStart w:id="32" w:name="X05df24af6ef1c387c8be82c4b820ea12f2206f0"/>
+    <w:bookmarkEnd w:id="30"/>
+    <w:bookmarkStart w:id="31" w:name="X05df24af6ef1c387c8be82c4b820ea12f2206f0"/>
     <w:p>
       <w:pPr>
         <w:pStyle w:val="Heading3"/>
@@ -5773,8 +5763,8 @@
         <w:t xml:space="preserve">number.</w:t>
       </w:r>
     </w:p>
-    <w:bookmarkEnd w:id="32"/>
-    <w:bookmarkStart w:id="33" w:name="X055152364bf380a89f3090bc737b727d3504d0b"/>
+    <w:bookmarkEnd w:id="31"/>
+    <w:bookmarkStart w:id="32" w:name="X055152364bf380a89f3090bc737b727d3504d0b"/>
     <w:p>
       <w:pPr>
         <w:pStyle w:val="Heading3"/>
@@ -5791,8 +5781,8 @@
         <w:t xml:space="preserve">We also report an ICC(2,1) days-as-raters analysis as an internal noise-floor check (full numbers in Table S1). The ICC and bootstrap week-pair r agree on metric ranking, with ICC uniformly more conservative because it treats within-week noise as rater disagreement. The bootstrap week-pair r is the recommended headline statistic for clinical claims; the ICC is included as a diagnostic.</w:t>
       </w:r>
     </w:p>
-    <w:bookmarkEnd w:id="33"/>
-    <w:bookmarkStart w:id="34" w:name="s10.4-fairness-disparities-recovered"/>
+    <w:bookmarkEnd w:id="32"/>
+    <w:bookmarkStart w:id="33" w:name="s10.4-fairness-disparities-recovered"/>
     <w:p>
       <w:pPr>
         <w:pStyle w:val="Heading3"/>
@@ -6135,8 +6125,8 @@
         <w:t xml:space="preserve">The injected effects were 0.85 vs 1.00 SQI multiplier for device C vs A (recovers as a 13.02-point gap) and 0.12 × proxy for skin tone (recovers as a 9.53-point gap). Both gaps have bootstrap 95% CIs (Section 2.7).</w:t>
       </w:r>
     </w:p>
-    <w:bookmarkEnd w:id="34"/>
-    <w:bookmarkStart w:id="35" w:name="s10.5-causal-adjusted-confounding"/>
+    <w:bookmarkEnd w:id="33"/>
+    <w:bookmarkStart w:id="34" w:name="s10.5-causal-adjusted-confounding"/>
     <w:p>
       <w:pPr>
         <w:pStyle w:val="Heading3"/>
@@ -6681,8 +6671,8 @@
         <w:t xml:space="preserve">The heat_index → HRV and heat_index → sleep_efficiency rows in Table S8 illustrate the diagnostic in the opposite direction. The framework’s positivity check flags a violation for both heat_index treatments (Kish effective sample size 63%), meaning the propensity-score model produced effective sample sizes too small to support reliable adjusted estimation. The AIPW point estimates for the heat_index treatments are consequently reported with a positivity-violation warning attached to the analysis output and are not interpreted as substantive causal claims. The rows are included in Table S8 to demonstrate that the framework refuses to commit to a causal interpretation when the propensity-score assumption is empirically inadequate, rather than reporting a point estimate with the same authority as the active_minutes case. Positivity and E-value sensitivity output for both treatments is in Section S2.</w:t>
       </w:r>
     </w:p>
-    <w:bookmarkEnd w:id="35"/>
-    <w:bookmarkStart w:id="36" w:name="s10.6-learned-trust-score-weights"/>
+    <w:bookmarkEnd w:id="34"/>
+    <w:bookmarkStart w:id="35" w:name="s10.6-learned-trust-score-weights"/>
     <w:p>
       <w:pPr>
         <w:pStyle w:val="Heading3"/>
@@ -6699,8 +6689,8 @@
         <w:t xml:space="preserve">A 6-component weight-simplex search (Dirichlet sampling plus local grid refinement, 360 candidates) returned holdout Spearman ρ = +0.668 (n_holdout = 90) against a week-over-week HRV RMSSD reproducibility target, compared with +0.592 in training (n_train = 210). The learned weights emphasize signal_quality over confounding_risk but remain within the convex hull of plausible weightings; the default weights are within 0.08 Spearman of the optimum, supporting the policy of shipping the defaults and exposing the weights as user-configurable. Full training-vs-holdout breakdown in Section S6.</w:t>
       </w:r>
     </w:p>
-    <w:bookmarkEnd w:id="36"/>
-    <w:bookmarkStart w:id="45" w:name="s10.7-cross-cohort-generalization"/>
+    <w:bookmarkEnd w:id="35"/>
+    <w:bookmarkStart w:id="39" w:name="s10.7-cross-cohort-generalization"/>
     <w:p>
       <w:pPr>
         <w:pStyle w:val="Heading3"/>
@@ -6726,18 +6716,18 @@
           <wp:inline>
             <wp:extent cx="5334000" cy="1751128"/>
             <wp:effectExtent b="0" l="0" r="0" t="0"/>
-            <wp:docPr descr="Supplementary Figure S6. Cross-cohort parameter-sweep validation across five synthetic regimes (default, strong environment, inverted skin-tone, severe device bias, clean world). Seven of eight qualitative predictions pass. The sign-flip on the skin-tone gap under the inverted-penalty regime confirms that the audit responds to cohort parameters rather than to fixed generator values." title="" id="38" name="Picture"/>
+            <wp:docPr descr="Supplementary Figure S6. Cross-cohort parameter-sweep validation across five synthetic regimes (default, strong environment, inverted skin-tone, severe device bias, clean world). Seven of eight qualitative predictions pass. The sign-flip on the skin-tone gap under the inverted-penalty regime confirms that the audit responds to cohort parameters rather than to fixed generator values." title="" id="37" name="Picture"/>
             <a:graphic>
               <a:graphicData uri="http://schemas.openxmlformats.org/drawingml/2006/picture">
                 <pic:pic>
                   <pic:nvPicPr>
-                    <pic:cNvPr descr="paper/figures/fig3_cross_cohort.png" id="39" name="Picture"/>
+                    <pic:cNvPr descr="paper/figures/fig3_cross_cohort.png" id="38" name="Picture"/>
                     <pic:cNvPicPr>
                       <a:picLocks noChangeArrowheads="1" noChangeAspect="1"/>
                     </pic:cNvPicPr>
                   </pic:nvPicPr>
                   <pic:blipFill>
-                    <a:blip r:embed="rId37"/>
+                    <a:blip r:embed="rId36"/>
                     <a:stretch>
                       <a:fillRect/>
                     </a:stretch>
@@ -6772,8 +6762,19 @@
         <w:t xml:space="preserve">Supplementary Figure S6. Cross-cohort parameter-sweep validation across five synthetic regimes (default, strong environment, inverted skin-tone, severe device bias, clean world). Seven of eight qualitative predictions pass. The sign-flip on the skin-tone gap under the inverted-penalty regime confirms that the audit responds to cohort parameters rather than to fixed generator values.</w:t>
       </w:r>
     </w:p>
-    <w:bookmarkStart w:id="44" w:name="refs"/>
-    <w:bookmarkStart w:id="41" w:name="ref-cliff1993"/>
+    <w:bookmarkEnd w:id="39"/>
+    <w:bookmarkEnd w:id="40"/>
+    <w:bookmarkStart w:id="46" w:name="references"/>
+    <w:p>
+      <w:pPr>
+        <w:pStyle w:val="Heading2"/>
+      </w:pPr>
+      <w:r>
+        <w:t xml:space="preserve">References</w:t>
+      </w:r>
+    </w:p>
+    <w:bookmarkStart w:id="45" w:name="refs"/>
+    <w:bookmarkStart w:id="42" w:name="ref-cliff1993"/>
     <w:p>
       <w:pPr>
         <w:pStyle w:val="Bibliography"/>
@@ -6806,7 +6807,7 @@
       <w:r>
         <w:t xml:space="preserve"> </w:t>
       </w:r>
-      <w:hyperlink r:id="rId40">
+      <w:hyperlink r:id="rId41">
         <w:r>
           <w:rPr>
             <w:rStyle w:val="Hyperlink"/>
@@ -6818,8 +6819,8 @@
         <w:t xml:space="preserve">.</w:t>
       </w:r>
     </w:p>
-    <w:bookmarkEnd w:id="41"/>
-    <w:bookmarkStart w:id="43" w:name="ref-vanderweele2017"/>
+    <w:bookmarkEnd w:id="42"/>
+    <w:bookmarkStart w:id="44" w:name="ref-vanderweele2017"/>
     <w:p>
       <w:pPr>
         <w:pStyle w:val="Bibliography"/>
@@ -6861,7 +6862,7 @@
       <w:r>
         <w:t xml:space="preserve"> </w:t>
       </w:r>
-      <w:hyperlink r:id="rId42">
+      <w:hyperlink r:id="rId43">
         <w:r>
           <w:rPr>
             <w:rStyle w:val="Hyperlink"/>
@@ -6873,7 +6874,6 @@
         <w:t xml:space="preserve">.</w:t>
       </w:r>
     </w:p>
-    <w:bookmarkEnd w:id="43"/>
     <w:bookmarkEnd w:id="44"/>
     <w:bookmarkEnd w:id="45"/>
     <w:bookmarkEnd w:id="46"/>

</xml_diff>